<commit_message>
Se avanzo con la creación de la interfaz en html
</commit_message>
<xml_diff>
--- a/GUIA_CODIGO_PASO_A_PASO_proyecto_Odontologico.docx
+++ b/GUIA_CODIGO_PASO_A_PASO_proyecto_Odontologico.docx
@@ -2162,9 +2162,6 @@
       <w:bookmarkStart w:id="5" w:name="X652963e2d8811121913cb22147ce7ec98815d1a"/>
       <w:bookmarkEnd w:id="4"/>
       <w:r>
-        <w:rPr>
-          <w:highlight w:val="red"/>
-        </w:rPr>
         <w:t>Paso 4. Abre Visual Studio Code y arrastra la carpeta creada</w:t>
       </w:r>
     </w:p>
@@ -3601,16 +3598,36 @@
         <w:rPr>
           <w:rStyle w:val="VerbatimChar"/>
         </w:rPr>
-        <w:t xml:space="preserve">      &lt;div class="campo"&gt;&lt;label class="etiqueta" for="campo-usuario"&gt;Usuario&lt;/label&gt;&lt;input class="entrada" type="text" id="campo-usuario" name="usuario" autocomplete="username" placeholder="Ingrese su usuario"&gt;&lt;/div&gt;</w:t>
-      </w:r>
-      <w:r>
-        <w:br/>
-      </w:r>
-      <w:r>
-        <w:rPr>
-          <w:rStyle w:val="VerbatimChar"/>
-        </w:rPr>
-        <w:t xml:space="preserve">      &lt;div class="campo"&gt;&lt;label class="etiqueta" for="campo-clave"&gt;Contraseña&lt;/label&gt;&lt;input class="entrada" type="password" id="campo-clave" name="clave" autocomplete="current-password" placeholder="Ingrese su contraseña"&gt;&lt;/div&gt;</w:t>
+        <w:t xml:space="preserve">      &lt;div class="campo"&gt;&lt;label class="etiqueta" for="campo-usuario"&gt;Usuario&lt;/label&gt;&lt;input class="entrada" type="text" id="campo-usuario" name="usuario" autocomplete="username" placeholder="Ingrese su usuario</w:t>
+      </w:r>
+      <w:r>
+        <w:rPr>
+          <w:rStyle w:val="VerbatimChar"/>
+        </w:rPr>
+        <w:t>"&gt;&lt;/div&gt;</w:t>
+      </w:r>
+      <w:r>
+        <w:br/>
+      </w:r>
+      <w:r>
+        <w:rPr>
+          <w:rStyle w:val="VerbatimChar"/>
+        </w:rPr>
+        <w:t xml:space="preserve">      &lt;div class="campo"&gt;&lt;label class="etiqueta" for="campo-clave"&gt;Contraseña&lt;/label&gt;&lt;input class="entrada" type="password" id="campo-clave" name="clave" autocomplete="current-password" placeholder="Ingrese su </w:t>
+      </w:r>
+      <w:proofErr w:type="spellStart"/>
+      <w:r>
+        <w:rPr>
+          <w:rStyle w:val="VerbatimChar"/>
+        </w:rPr>
+        <w:t>contraseña</w:t>
+      </w:r>
+      <w:proofErr w:type="spellEnd"/>
+      <w:r>
+        <w:rPr>
+          <w:rStyle w:val="VerbatimChar"/>
+        </w:rPr>
+        <w:t>"&gt;&lt;/div&gt;</w:t>
       </w:r>
       <w:r>
         <w:br/>
@@ -3628,7 +3645,13 @@
         <w:rPr>
           <w:rStyle w:val="VerbatimChar"/>
         </w:rPr>
-        <w:t xml:space="preserve">      &lt;button class="boton boton-primario boton-bloque" type="submit" id="boton-ingresar"&gt;Ingresar&lt;/button&gt;</w:t>
+        <w:t xml:space="preserve">      &lt;button class="boton </w:t>
+      </w:r>
+      <w:r>
+        <w:rPr>
+          <w:rStyle w:val="VerbatimChar"/>
+        </w:rPr>
+        <w:t>boton-primario boton-bloque" type="submit" id="boton-ingresar"&gt;Ingresar&lt;/button&gt;</w:t>
       </w:r>
       <w:r>
         <w:br/>
@@ -4097,68 +4120,233 @@
         <w:rPr>
           <w:rStyle w:val="VerbatimChar"/>
         </w:rPr>
-        <w:t xml:space="preserve">    &lt;div class="marca" id="marca"&gt;&lt;svg class="icono " aria-hidden="true"&gt;&lt;use href="#icono-diente"&gt;&lt;/use&gt;&lt;/svg&gt;&lt;span class="marca-texto"&gt;Consultorio NADINNE&lt;span class="marca-subtitulo"&gt;Odontología&lt;/span&gt;&lt;/span&gt;&lt;/div&gt;</w:t>
-      </w:r>
-      <w:r>
-        <w:br/>
-      </w:r>
-      <w:r>
-        <w:rPr>
-          <w:rStyle w:val="VerbatimChar"/>
-        </w:rPr>
-        <w:t xml:space="preserve">    &lt;ul class="menu" id="menu-lateral"&gt;</w:t>
-      </w:r>
-      <w:r>
-        <w:br/>
-      </w:r>
-      <w:r>
-        <w:rPr>
-          <w:rStyle w:val="VerbatimChar"/>
-        </w:rPr>
-        <w:t xml:space="preserve">        &lt;li&gt;&lt;a class="menu-enlace activo" aria-current="page" id="menu-panel" href="panel_principal.html" title="Panel principal"&gt;&lt;svg class="icono " aria-hidden="true"&gt;&lt;use href="#icono-panel"&gt;&lt;/use&gt;&lt;/svg&gt;&lt;span class="menu-texto"&gt;Panel principal&lt;/span&gt;&lt;/a&gt;&lt;/li&gt;</w:t>
-      </w:r>
-      <w:r>
-        <w:br/>
-      </w:r>
-      <w:r>
-        <w:rPr>
-          <w:rStyle w:val="VerbatimChar"/>
-        </w:rPr>
-        <w:t xml:space="preserve">        &lt;li&gt;&lt;a class="menu-enlace" id="menu-pacientes" href="pacientes.html" title="Pacientes"&gt;&lt;svg class="icono " aria-hidden="true"&gt;&lt;use href="#icono-pacientes"&gt;&lt;/use&gt;&lt;/svg&gt;&lt;span class="menu-texto"&gt;Pacientes&lt;/span&gt;&lt;/a&gt;&lt;/li&gt;</w:t>
-      </w:r>
-      <w:r>
-        <w:br/>
-      </w:r>
-      <w:r>
-        <w:rPr>
-          <w:rStyle w:val="VerbatimChar"/>
-        </w:rPr>
-        <w:t xml:space="preserve">        &lt;li&gt;&lt;a class="menu-enlace" id="menu-citas" href="citas.html" title="Citas"&gt;&lt;svg class="icono " aria-hidden="true"&gt;&lt;use href="#icono-citas"&gt;&lt;/use&gt;&lt;/svg&gt;&lt;span class="menu-texto"&gt;Citas&lt;/span&gt;&lt;/a&gt;&lt;/li&gt;</w:t>
-      </w:r>
-      <w:r>
-        <w:br/>
-      </w:r>
-      <w:r>
-        <w:rPr>
-          <w:rStyle w:val="VerbatimChar"/>
-        </w:rPr>
-        <w:t xml:space="preserve">        &lt;li&gt;&lt;a class="menu-enlace" id="menu-atencion" href="atencion_paciente.html" title="Atención de paciente"&gt;&lt;svg class="icono " aria-hidden="true"&gt;&lt;use href="#icono-</w:t>
+        <w:t xml:space="preserve">    &lt;div class="marca" id="marca"&gt;&lt;svg class="icono " </w:t>
+      </w:r>
+      <w:r>
+        <w:rPr>
+          <w:rStyle w:val="VerbatimChar"/>
+        </w:rPr>
+        <w:t>aria-</w:t>
+      </w:r>
+      <w:r>
+        <w:rPr>
+          <w:rStyle w:val="VerbatimChar"/>
+        </w:rPr>
+        <w:t>hidden="true"&gt;&lt;use href="#icono-diente"&gt;&lt;/use&gt;&lt;/svg&gt;&lt;span class="marca-texto"&gt;Consultorio NADINNE&lt;span class="marca-subtitulo"&gt;Odontología&lt;/span</w:t>
+      </w:r>
+      <w:r>
+        <w:rPr>
+          <w:rStyle w:val="VerbatimChar"/>
+        </w:rPr>
+        <w:t>&gt;&lt;/span&gt;&lt;/div&gt;</w:t>
+      </w:r>
+      <w:r>
+        <w:br/>
+      </w:r>
+      <w:r>
+        <w:rPr>
+          <w:rStyle w:val="VerbatimChar"/>
+        </w:rPr>
+        <w:t xml:space="preserve">    </w:t>
+      </w:r>
+      <w:r>
+        <w:rPr>
+          <w:rStyle w:val="VerbatimChar"/>
+        </w:rPr>
+        <w:t>&lt;ul class="menu" id="menu</w:t>
+      </w:r>
+      <w:r>
+        <w:rPr>
+          <w:rStyle w:val="VerbatimChar"/>
+        </w:rPr>
+        <w:t>-lateral"&gt;</w:t>
+      </w:r>
+      <w:r>
+        <w:br/>
+      </w:r>
+      <w:r>
+        <w:rPr>
+          <w:rStyle w:val="VerbatimChar"/>
+        </w:rPr>
+        <w:t xml:space="preserve">        &lt;li&gt;&lt;a class="menu-enlace activo" aria-current="page" id="menu-panel" href="panel_principal.html" title="Panel </w:t>
+      </w:r>
+      <w:r>
+        <w:rPr>
+          <w:rStyle w:val="VerbatimChar"/>
+        </w:rPr>
+        <w:t>principal"&gt;&lt;svg</w:t>
+      </w:r>
+      <w:r>
+        <w:rPr>
+          <w:rStyle w:val="VerbatimChar"/>
+        </w:rPr>
+        <w:t xml:space="preserve"> class="icono " aria-hidden="true"&gt;&lt;use href="#icono-panel"&gt;&lt;/use&gt;&lt;/svg&gt;&lt;span class="menu-texto"&gt;Panel principal&lt;/span</w:t>
+      </w:r>
+      <w:r>
+        <w:rPr>
+          <w:rStyle w:val="VerbatimChar"/>
+        </w:rPr>
+        <w:t>&gt;&lt;/a&gt;&lt;/li&gt;</w:t>
+      </w:r>
+      <w:r>
+        <w:br/>
+      </w:r>
+      <w:r>
+        <w:rPr>
+          <w:rStyle w:val="VerbatimChar"/>
+        </w:rPr>
+        <w:t xml:space="preserve">        &lt;li&gt;&lt;a class="menu-enlace" id="menu-pacientes" href="pacientes.html" title="Pacientes"&gt;&lt;svg class="icono " aria-hidden="true"&gt;&lt;use href="#icono-pacientes"&gt;&lt;/use&gt;&lt;/svg&gt;&lt;span class="menu-texto"&gt;Pacientes&lt;/</w:t>
+      </w:r>
+      <w:r>
+        <w:rPr>
+          <w:rStyle w:val="VerbatimChar"/>
+        </w:rPr>
+        <w:t>span&gt;&lt;/a&gt;&lt;/li&gt;</w:t>
+      </w:r>
+      <w:r>
+        <w:br/>
+      </w:r>
+      <w:r>
+        <w:rPr>
+          <w:rStyle w:val="VerbatimChar"/>
+        </w:rPr>
+        <w:t xml:space="preserve">        &lt;li&gt;&lt;a class="menu-enlace" id="menu-citas" href="citas.html" title="Citas"&gt;&lt;svg class="icono " aria-hidden="true"&gt;&lt;use href="#icono-citas"&gt;&lt;/use&gt;&lt;/svg&gt;&lt;span class="menu-texto"&gt;</w:t>
+      </w:r>
+      <w:r>
+        <w:rPr>
+          <w:rStyle w:val="VerbatimChar"/>
+        </w:rPr>
+        <w:t>Citas&lt;/span&gt;&lt;/a&gt;&lt;/li&gt;</w:t>
+      </w:r>
+      <w:r>
+        <w:br/>
+      </w:r>
+      <w:r>
+        <w:rPr>
+          <w:rStyle w:val="VerbatimChar"/>
+        </w:rPr>
+        <w:t xml:space="preserve">        &lt;li&gt;&lt;a class="menu-enlace" id="menu-atencion" href="atencion_paciente.html" title="Atención de paciente"&gt;&lt;svg class="icono " aria-hidden="true"&gt;&lt;use </w:t>
+      </w:r>
+      <w:proofErr w:type="spellStart"/>
+      <w:r>
+        <w:rPr>
+          <w:rStyle w:val="VerbatimChar"/>
+        </w:rPr>
+        <w:t>href</w:t>
+      </w:r>
+      <w:proofErr w:type="spellEnd"/>
+      <w:r>
+        <w:rPr>
+          <w:rStyle w:val="VerbatimChar"/>
+        </w:rPr>
+        <w:t>="#</w:t>
+      </w:r>
+      <w:proofErr w:type="spellStart"/>
+      <w:r>
+        <w:rPr>
+          <w:rStyle w:val="VerbatimChar"/>
+        </w:rPr>
+        <w:t>icono-</w:t>
       </w:r>
       <w:r>
         <w:rPr>
           <w:rStyle w:val="VerbatimChar"/>
         </w:rPr>
         <w:lastRenderedPageBreak/>
-        <w:t>atencion"&gt;&lt;/use&gt;&lt;/svg&gt;&lt;span class="menu-texto"&gt;Atención de paciente&lt;/span&gt;&lt;/a&gt;&lt;/li&gt;</w:t>
-      </w:r>
-      <w:r>
-        <w:br/>
-      </w:r>
-      <w:r>
-        <w:rPr>
-          <w:rStyle w:val="VerbatimChar"/>
-        </w:rPr>
-        <w:t xml:space="preserve">        &lt;li&gt;&lt;a class="menu-enlace" id="menu-pagos" href="pagos.html" title="Pagos"&gt;&lt;svg class="icono " aria-hidden="true"&gt;&lt;use href="#icono-pagos"&gt;&lt;/use&gt;&lt;/svg&gt;&lt;span class="menu-texto"&gt;Pagos&lt;/span&gt;&lt;/a&gt;&lt;/li&gt;</w:t>
+        <w:t>atencion</w:t>
+      </w:r>
+      <w:proofErr w:type="spellEnd"/>
+      <w:r>
+        <w:rPr>
+          <w:rStyle w:val="VerbatimChar"/>
+        </w:rPr>
+        <w:t>"&gt;&lt;/use&gt;&lt;/</w:t>
+      </w:r>
+      <w:proofErr w:type="spellStart"/>
+      <w:r>
+        <w:rPr>
+          <w:rStyle w:val="VerbatimChar"/>
+        </w:rPr>
+        <w:t>svg</w:t>
+      </w:r>
+      <w:proofErr w:type="spellEnd"/>
+      <w:r>
+        <w:rPr>
+          <w:rStyle w:val="VerbatimChar"/>
+        </w:rPr>
+        <w:t>&gt;&lt;span class="menu-</w:t>
+      </w:r>
+      <w:proofErr w:type="spellStart"/>
+      <w:r>
+        <w:rPr>
+          <w:rStyle w:val="VerbatimChar"/>
+        </w:rPr>
+        <w:t>texto</w:t>
+      </w:r>
+      <w:proofErr w:type="spellEnd"/>
+      <w:r>
+        <w:rPr>
+          <w:rStyle w:val="VerbatimChar"/>
+        </w:rPr>
+        <w:t>"&gt;</w:t>
+      </w:r>
+      <w:proofErr w:type="spellStart"/>
+      <w:r>
+        <w:rPr>
+          <w:rStyle w:val="VerbatimChar"/>
+        </w:rPr>
+        <w:t>Atención</w:t>
+      </w:r>
+      <w:proofErr w:type="spellEnd"/>
+      <w:r>
+        <w:rPr>
+          <w:rStyle w:val="VerbatimChar"/>
+        </w:rPr>
+        <w:t xml:space="preserve"> de </w:t>
+      </w:r>
+      <w:proofErr w:type="spellStart"/>
+      <w:r>
+        <w:rPr>
+          <w:rStyle w:val="VerbatimChar"/>
+        </w:rPr>
+        <w:t>paciente</w:t>
+      </w:r>
+      <w:proofErr w:type="spellEnd"/>
+      <w:r>
+        <w:rPr>
+          <w:rStyle w:val="VerbatimChar"/>
+        </w:rPr>
+        <w:t>&lt;/span</w:t>
+      </w:r>
+      <w:r>
+        <w:rPr>
+          <w:rStyle w:val="VerbatimChar"/>
+          <w:highlight w:val="red"/>
+        </w:rPr>
+        <w:t>&gt;&lt;/a&gt;&lt;/li&gt;</w:t>
+      </w:r>
+      <w:r>
+        <w:br/>
+      </w:r>
+      <w:r>
+        <w:rPr>
+          <w:rStyle w:val="VerbatimChar"/>
+        </w:rPr>
+        <w:t xml:space="preserve">        &lt;li&gt;&lt;a class="menu-enlace" id="menu-</w:t>
+      </w:r>
+      <w:proofErr w:type="spellStart"/>
+      <w:r>
+        <w:rPr>
+          <w:rStyle w:val="VerbatimChar"/>
+        </w:rPr>
+        <w:t>pagos</w:t>
+      </w:r>
+      <w:proofErr w:type="spellEnd"/>
+      <w:r>
+        <w:rPr>
+          <w:rStyle w:val="VerbatimChar"/>
+        </w:rPr>
+        <w:t>" href="pagos.html" title="Pagos"&gt;&lt;svg class="icono " aria-hidden="true"&gt;&lt;use href="#icono-pagos"&gt;&lt;/use&gt;&lt;/svg&gt;&lt;span class="menu-texto"&gt;Pagos&lt;/span&gt;&lt;/a&gt;&lt;/li&gt;</w:t>
       </w:r>
       <w:r>
         <w:br/>

</xml_diff>